<commit_message>
Modified Credit Card Customer Churn.docx
</commit_message>
<xml_diff>
--- a/credit card customer churn/Credit Card Customer Churn.docx
+++ b/credit card customer churn/Credit Card Customer Churn.docx
@@ -24,40 +24,7 @@
           <w:szCs w:val="40"/>
           <w:lang w:val="en-IN" w:eastAsia="en-US"/>
         </w:rPr>
-        <w:t xml:space="preserve">Capstone Project </w:t>
-      </w:r>
-      <w:r>
-        <w:rPr>
-          <w:rFonts w:ascii="Calibri" w:eastAsia="Calibri" w:hAnsi="Calibri" w:cs="Times New Roman"/>
-          <w:b/>
-          <w:bCs/>
-          <w:sz w:val="40"/>
-          <w:szCs w:val="40"/>
-          <w:lang w:val="en-IN" w:eastAsia="en-US"/>
-        </w:rPr>
-        <w:t>2</w:t>
-      </w:r>
-      <w:r>
-        <w:rPr>
-          <w:rFonts w:ascii="Calibri" w:eastAsia="Calibri" w:hAnsi="Calibri" w:cs="Times New Roman"/>
-          <w:b/>
-          <w:bCs/>
-          <w:sz w:val="40"/>
-          <w:szCs w:val="40"/>
-          <w:lang w:val="en-IN" w:eastAsia="en-US"/>
-        </w:rPr>
-        <w:t xml:space="preserve"> – </w:t>
-      </w:r>
-      <w:r>
-        <w:rPr>
-          <w:rFonts w:ascii="Calibri" w:eastAsia="Calibri" w:hAnsi="Calibri" w:cs="Times New Roman"/>
-          <w:b/>
-          <w:bCs/>
-          <w:sz w:val="40"/>
-          <w:szCs w:val="40"/>
-          <w:lang w:val="en-IN" w:eastAsia="en-US"/>
-        </w:rPr>
-        <w:t>Credit Card Customer Churn</w:t>
+        <w:t>Capstone Project 2 – Credit Card Customer Churn</w:t>
       </w:r>
     </w:p>
     <w:p>
@@ -99,7 +66,7 @@
           <w:szCs w:val="28"/>
         </w:rPr>
         <w:drawing>
-          <wp:anchor distT="0" distB="0" distL="114300" distR="114300" simplePos="0" relativeHeight="251658240" behindDoc="0" locked="0" layoutInCell="1" allowOverlap="1" wp14:anchorId="1F96FC0D" wp14:editId="4C657B41">
+          <wp:anchor distT="0" distB="0" distL="114300" distR="114300" simplePos="0" relativeHeight="251659264" behindDoc="0" locked="0" layoutInCell="1" allowOverlap="1" wp14:anchorId="7C7F2B08" wp14:editId="35A2C48C">
             <wp:simplePos x="0" y="0"/>
             <wp:positionH relativeFrom="page">
               <wp:posOffset>4076700</wp:posOffset>
@@ -124,7 +91,7 @@
                     </pic:cNvPicPr>
                   </pic:nvPicPr>
                   <pic:blipFill>
-                    <a:blip r:embed="rId7">
+                    <a:blip r:embed="rId6">
                       <a:extLst>
                         <a:ext uri="{28A0092B-C50C-407E-A947-70E740481C1C}">
                           <a14:useLocalDpi xmlns:a14="http://schemas.microsoft.com/office/drawing/2010/main" val="0"/>
@@ -1434,7 +1401,6 @@
                 <w:rFonts w:ascii="Calibri" w:eastAsia="Times New Roman" w:hAnsi="Calibri" w:cs="Calibri"/>
                 <w:color w:val="000000"/>
               </w:rPr>
-              <w:lastRenderedPageBreak/>
               <w:t>Total_Revolving_Bal</w:t>
             </w:r>
             <w:proofErr w:type="spellEnd"/>
@@ -1572,6 +1538,7 @@
                 <w:rFonts w:ascii="Calibri" w:eastAsia="Times New Roman" w:hAnsi="Calibri" w:cs="Calibri"/>
                 <w:color w:val="000000"/>
               </w:rPr>
+              <w:lastRenderedPageBreak/>
               <w:t>Total_Amt_Chng_Q4_Q1</w:t>
             </w:r>
           </w:p>
@@ -1928,7 +1895,7 @@
       </w:pPr>
     </w:p>
     <w:p>
-      <w:hyperlink r:id="rId8" w:history="1">
+      <w:hyperlink r:id="rId7" w:history="1">
         <w:r>
           <w:rPr>
             <w:rStyle w:val="Hyperlink"/>
@@ -1938,9 +1905,10 @@
       </w:hyperlink>
     </w:p>
     <w:p/>
+    <w:p/>
     <w:sectPr>
-      <w:headerReference w:type="default" r:id="rId9"/>
-      <w:footerReference w:type="default" r:id="rId10"/>
+      <w:headerReference w:type="default" r:id="rId8"/>
+      <w:footerReference w:type="default" r:id="rId9"/>
       <w:pgSz w:w="11909" w:h="16834"/>
       <w:pgMar w:top="720" w:right="720" w:bottom="720" w:left="720" w:header="720" w:footer="720" w:gutter="0"/>
       <w:pgNumType w:start="1"/>
@@ -2035,355 +2003,8 @@
     <w:pPr>
       <w:jc w:val="right"/>
     </w:pPr>
-    <w:r>
-      <w:pict w14:anchorId="41FD8FFF">
-        <v:shapetype id="_x0000_t75" coordsize="21600,21600" o:spt="75" o:preferrelative="t" path="m@4@5l@4@11@9@11@9@5xe" filled="f" stroked="f">
-          <v:stroke joinstyle="miter"/>
-          <v:formulas>
-            <v:f eqn="if lineDrawn pixelLineWidth 0"/>
-            <v:f eqn="sum @0 1 0"/>
-            <v:f eqn="sum 0 0 @1"/>
-            <v:f eqn="prod @2 1 2"/>
-            <v:f eqn="prod @3 21600 pixelWidth"/>
-            <v:f eqn="prod @3 21600 pixelHeight"/>
-            <v:f eqn="sum @0 0 1"/>
-            <v:f eqn="prod @6 1 2"/>
-            <v:f eqn="prod @7 21600 pixelWidth"/>
-            <v:f eqn="sum @8 21600 0"/>
-            <v:f eqn="prod @7 21600 pixelHeight"/>
-            <v:f eqn="sum @10 21600 0"/>
-          </v:formulas>
-          <v:path o:extrusionok="f" gradientshapeok="t" o:connecttype="rect"/>
-          <o:lock v:ext="edit" aspectratio="t"/>
-        </v:shapetype>
-        <v:shape id="WordPictureWatermark1" o:spid="_x0000_s2049" type="#_x0000_t75" alt="" style="position:absolute;left:0;text-align:left;margin-left:0;margin-top:0;width:225.65pt;height:225.65pt;z-index:-251658752;mso-position-horizontal:center;mso-position-horizontal-relative:margin;mso-position-vertical:center;mso-position-vertical-relative:margin">
-          <v:imagedata r:id="rId1" o:title="image3" gain="19661f" blacklevel="22938f"/>
-          <w10:wrap anchorx="margin" anchory="margin"/>
-        </v:shape>
-      </w:pict>
-    </w:r>
-    <w:r>
-      <w:rPr>
-        <w:noProof/>
-      </w:rPr>
-      <w:drawing>
-        <wp:inline distT="114300" distB="114300" distL="114300" distR="114300" wp14:anchorId="378A01E7" wp14:editId="4477D3B5">
-          <wp:extent cx="519113" cy="519113"/>
-          <wp:effectExtent l="0" t="0" r="0" b="0"/>
-          <wp:docPr id="1" name="image1.jpg"/>
-          <wp:cNvGraphicFramePr/>
-          <a:graphic xmlns:a="http://schemas.openxmlformats.org/drawingml/2006/main">
-            <a:graphicData uri="http://schemas.openxmlformats.org/drawingml/2006/picture">
-              <pic:pic xmlns:pic="http://schemas.openxmlformats.org/drawingml/2006/picture">
-                <pic:nvPicPr>
-                  <pic:cNvPr id="0" name="image1.jpg"/>
-                  <pic:cNvPicPr preferRelativeResize="0"/>
-                </pic:nvPicPr>
-                <pic:blipFill>
-                  <a:blip r:embed="rId2"/>
-                  <a:srcRect/>
-                  <a:stretch>
-                    <a:fillRect/>
-                  </a:stretch>
-                </pic:blipFill>
-                <pic:spPr>
-                  <a:xfrm>
-                    <a:off x="0" y="0"/>
-                    <a:ext cx="519113" cy="519113"/>
-                  </a:xfrm>
-                  <a:prstGeom prst="rect">
-                    <a:avLst/>
-                  </a:prstGeom>
-                  <a:ln/>
-                </pic:spPr>
-              </pic:pic>
-            </a:graphicData>
-          </a:graphic>
-        </wp:inline>
-      </w:drawing>
-    </w:r>
   </w:p>
 </w:hdr>
-</file>
-
-<file path=word/numbering.xml><?xml version="1.0" encoding="utf-8"?>
-<w:numbering xmlns:wpc="http://schemas.microsoft.com/office/word/2010/wordprocessingCanvas" xmlns:cx="http://schemas.microsoft.com/office/drawing/2014/chartex" xmlns:cx1="http://schemas.microsoft.com/office/drawing/2015/9/8/chartex" xmlns:cx2="http://schemas.microsoft.com/office/drawing/2015/10/21/chartex" xmlns:cx3="http://schemas.microsoft.com/office/drawing/2016/5/9/chartex" xmlns:cx4="http://schemas.microsoft.com/office/drawing/2016/5/10/chartex" xmlns:cx5="http://schemas.microsoft.com/office/drawing/2016/5/11/chartex" xmlns:cx6="http://schemas.microsoft.com/office/drawing/2016/5/12/chartex" xmlns:cx7="http://schemas.microsoft.com/office/drawing/2016/5/13/chartex" xmlns:cx8="http://schemas.microsoft.com/office/drawing/2016/5/14/chartex" xmlns:mc="http://schemas.openxmlformats.org/markup-compatibility/2006" xmlns:aink="http://schemas.microsoft.com/office/drawing/2016/ink" xmlns:am3d="http://schemas.microsoft.com/office/drawing/2017/model3d" xmlns:o="urn:schemas-microsoft-com:office:office" xmlns:oel="http://schemas.microsoft.com/office/2019/extlst" xmlns:r="http://schemas.openxmlformats.org/officeDocument/2006/relationships" xmlns:m="http://schemas.openxmlformats.org/officeDocument/2006/math" xmlns:v="urn:schemas-microsoft-com:vml" xmlns:wp14="http://schemas.microsoft.com/office/word/2010/wordprocessingDrawing" xmlns:wp="http://schemas.openxmlformats.org/drawingml/2006/wordprocessingDrawing" xmlns:w10="urn:schemas-microsoft-com:office:word" xmlns:w="http://schemas.openxmlformats.org/wordprocessingml/2006/main" xmlns:w14="http://schemas.microsoft.com/office/word/2010/wordml" xmlns:w15="http://schemas.microsoft.com/office/word/2012/wordml" xmlns:w16cex="http://schemas.microsoft.com/office/word/2018/wordml/cex" xmlns:w16cid="http://schemas.microsoft.com/office/word/2016/wordml/cid" xmlns:w16="http://schemas.microsoft.com/office/word/2018/wordml" xmlns:w16du="http://schemas.microsoft.com/office/word/2023/wordml/word16du" xmlns:w16sdtdh="http://schemas.microsoft.com/office/word/2020/wordml/sdtdatahash" xmlns:w16sdtfl="http://schemas.microsoft.com/office/word/2024/wordml/sdtformatlock" xmlns:w16se="http://schemas.microsoft.com/office/word/2015/wordml/symex" xmlns:wpg="http://schemas.microsoft.com/office/word/2010/wordprocessingGroup" xmlns:wpi="http://schemas.microsoft.com/office/word/2010/wordprocessingInk" xmlns:wne="http://schemas.microsoft.com/office/word/2006/wordml" xmlns:wps="http://schemas.microsoft.com/office/word/2010/wordprocessingShape" mc:Ignorable="w14 w15 w16se w16cid w16 w16cex w16sdtdh w16sdtfl w16du wp14">
-  <w:abstractNum w:abstractNumId="0" w15:restartNumberingAfterBreak="0">
-    <w:nsid w:val="1A817EF7"/>
-    <w:multiLevelType w:val="hybridMultilevel"/>
-    <w:tmpl w:val="2A44C400"/>
-    <w:lvl w:ilvl="0" w:tplc="4009000F">
-      <w:start w:val="1"/>
-      <w:numFmt w:val="decimal"/>
-      <w:lvlText w:val="%1."/>
-      <w:lvlJc w:val="left"/>
-      <w:pPr>
-        <w:ind w:left="720" w:hanging="360"/>
-      </w:pPr>
-    </w:lvl>
-    <w:lvl w:ilvl="1" w:tplc="40090019" w:tentative="1">
-      <w:start w:val="1"/>
-      <w:numFmt w:val="lowerLetter"/>
-      <w:lvlText w:val="%2."/>
-      <w:lvlJc w:val="left"/>
-      <w:pPr>
-        <w:ind w:left="1440" w:hanging="360"/>
-      </w:pPr>
-    </w:lvl>
-    <w:lvl w:ilvl="2" w:tplc="4009001B" w:tentative="1">
-      <w:start w:val="1"/>
-      <w:numFmt w:val="lowerRoman"/>
-      <w:lvlText w:val="%3."/>
-      <w:lvlJc w:val="right"/>
-      <w:pPr>
-        <w:ind w:left="2160" w:hanging="180"/>
-      </w:pPr>
-    </w:lvl>
-    <w:lvl w:ilvl="3" w:tplc="4009000F" w:tentative="1">
-      <w:start w:val="1"/>
-      <w:numFmt w:val="decimal"/>
-      <w:lvlText w:val="%4."/>
-      <w:lvlJc w:val="left"/>
-      <w:pPr>
-        <w:ind w:left="2880" w:hanging="360"/>
-      </w:pPr>
-    </w:lvl>
-    <w:lvl w:ilvl="4" w:tplc="40090019" w:tentative="1">
-      <w:start w:val="1"/>
-      <w:numFmt w:val="lowerLetter"/>
-      <w:lvlText w:val="%5."/>
-      <w:lvlJc w:val="left"/>
-      <w:pPr>
-        <w:ind w:left="3600" w:hanging="360"/>
-      </w:pPr>
-    </w:lvl>
-    <w:lvl w:ilvl="5" w:tplc="4009001B" w:tentative="1">
-      <w:start w:val="1"/>
-      <w:numFmt w:val="lowerRoman"/>
-      <w:lvlText w:val="%6."/>
-      <w:lvlJc w:val="right"/>
-      <w:pPr>
-        <w:ind w:left="4320" w:hanging="180"/>
-      </w:pPr>
-    </w:lvl>
-    <w:lvl w:ilvl="6" w:tplc="4009000F" w:tentative="1">
-      <w:start w:val="1"/>
-      <w:numFmt w:val="decimal"/>
-      <w:lvlText w:val="%7."/>
-      <w:lvlJc w:val="left"/>
-      <w:pPr>
-        <w:ind w:left="5040" w:hanging="360"/>
-      </w:pPr>
-    </w:lvl>
-    <w:lvl w:ilvl="7" w:tplc="40090019" w:tentative="1">
-      <w:start w:val="1"/>
-      <w:numFmt w:val="lowerLetter"/>
-      <w:lvlText w:val="%8."/>
-      <w:lvlJc w:val="left"/>
-      <w:pPr>
-        <w:ind w:left="5760" w:hanging="360"/>
-      </w:pPr>
-    </w:lvl>
-    <w:lvl w:ilvl="8" w:tplc="4009001B" w:tentative="1">
-      <w:start w:val="1"/>
-      <w:numFmt w:val="lowerRoman"/>
-      <w:lvlText w:val="%9."/>
-      <w:lvlJc w:val="right"/>
-      <w:pPr>
-        <w:ind w:left="6480" w:hanging="180"/>
-      </w:pPr>
-    </w:lvl>
-  </w:abstractNum>
-  <w:abstractNum w:abstractNumId="1" w15:restartNumberingAfterBreak="0">
-    <w:nsid w:val="46AA1FFA"/>
-    <w:multiLevelType w:val="hybridMultilevel"/>
-    <w:tmpl w:val="8432E366"/>
-    <w:lvl w:ilvl="0" w:tplc="562A20C0">
-      <w:start w:val="1"/>
-      <w:numFmt w:val="decimal"/>
-      <w:lvlText w:val="%1."/>
-      <w:lvlJc w:val="left"/>
-      <w:pPr>
-        <w:ind w:left="720" w:hanging="360"/>
-      </w:pPr>
-      <w:rPr>
-        <w:rFonts w:hint="default"/>
-        <w:b/>
-        <w:bCs/>
-      </w:rPr>
-    </w:lvl>
-    <w:lvl w:ilvl="1" w:tplc="40090019" w:tentative="1">
-      <w:start w:val="1"/>
-      <w:numFmt w:val="lowerLetter"/>
-      <w:lvlText w:val="%2."/>
-      <w:lvlJc w:val="left"/>
-      <w:pPr>
-        <w:ind w:left="1440" w:hanging="360"/>
-      </w:pPr>
-    </w:lvl>
-    <w:lvl w:ilvl="2" w:tplc="4009001B" w:tentative="1">
-      <w:start w:val="1"/>
-      <w:numFmt w:val="lowerRoman"/>
-      <w:lvlText w:val="%3."/>
-      <w:lvlJc w:val="right"/>
-      <w:pPr>
-        <w:ind w:left="2160" w:hanging="180"/>
-      </w:pPr>
-    </w:lvl>
-    <w:lvl w:ilvl="3" w:tplc="4009000F" w:tentative="1">
-      <w:start w:val="1"/>
-      <w:numFmt w:val="decimal"/>
-      <w:lvlText w:val="%4."/>
-      <w:lvlJc w:val="left"/>
-      <w:pPr>
-        <w:ind w:left="2880" w:hanging="360"/>
-      </w:pPr>
-    </w:lvl>
-    <w:lvl w:ilvl="4" w:tplc="40090019" w:tentative="1">
-      <w:start w:val="1"/>
-      <w:numFmt w:val="lowerLetter"/>
-      <w:lvlText w:val="%5."/>
-      <w:lvlJc w:val="left"/>
-      <w:pPr>
-        <w:ind w:left="3600" w:hanging="360"/>
-      </w:pPr>
-    </w:lvl>
-    <w:lvl w:ilvl="5" w:tplc="4009001B" w:tentative="1">
-      <w:start w:val="1"/>
-      <w:numFmt w:val="lowerRoman"/>
-      <w:lvlText w:val="%6."/>
-      <w:lvlJc w:val="right"/>
-      <w:pPr>
-        <w:ind w:left="4320" w:hanging="180"/>
-      </w:pPr>
-    </w:lvl>
-    <w:lvl w:ilvl="6" w:tplc="4009000F" w:tentative="1">
-      <w:start w:val="1"/>
-      <w:numFmt w:val="decimal"/>
-      <w:lvlText w:val="%7."/>
-      <w:lvlJc w:val="left"/>
-      <w:pPr>
-        <w:ind w:left="5040" w:hanging="360"/>
-      </w:pPr>
-    </w:lvl>
-    <w:lvl w:ilvl="7" w:tplc="40090019" w:tentative="1">
-      <w:start w:val="1"/>
-      <w:numFmt w:val="lowerLetter"/>
-      <w:lvlText w:val="%8."/>
-      <w:lvlJc w:val="left"/>
-      <w:pPr>
-        <w:ind w:left="5760" w:hanging="360"/>
-      </w:pPr>
-    </w:lvl>
-    <w:lvl w:ilvl="8" w:tplc="4009001B" w:tentative="1">
-      <w:start w:val="1"/>
-      <w:numFmt w:val="lowerRoman"/>
-      <w:lvlText w:val="%9."/>
-      <w:lvlJc w:val="right"/>
-      <w:pPr>
-        <w:ind w:left="6480" w:hanging="180"/>
-      </w:pPr>
-    </w:lvl>
-  </w:abstractNum>
-  <w:abstractNum w:abstractNumId="2" w15:restartNumberingAfterBreak="0">
-    <w:nsid w:val="68EF6336"/>
-    <w:multiLevelType w:val="hybridMultilevel"/>
-    <w:tmpl w:val="EAB6F296"/>
-    <w:lvl w:ilvl="0" w:tplc="4009000F">
-      <w:start w:val="1"/>
-      <w:numFmt w:val="decimal"/>
-      <w:lvlText w:val="%1."/>
-      <w:lvlJc w:val="left"/>
-      <w:pPr>
-        <w:ind w:left="720" w:hanging="360"/>
-      </w:pPr>
-      <w:rPr>
-        <w:rFonts w:hint="default"/>
-      </w:rPr>
-    </w:lvl>
-    <w:lvl w:ilvl="1" w:tplc="40090019" w:tentative="1">
-      <w:start w:val="1"/>
-      <w:numFmt w:val="lowerLetter"/>
-      <w:lvlText w:val="%2."/>
-      <w:lvlJc w:val="left"/>
-      <w:pPr>
-        <w:ind w:left="1440" w:hanging="360"/>
-      </w:pPr>
-    </w:lvl>
-    <w:lvl w:ilvl="2" w:tplc="4009001B" w:tentative="1">
-      <w:start w:val="1"/>
-      <w:numFmt w:val="lowerRoman"/>
-      <w:lvlText w:val="%3."/>
-      <w:lvlJc w:val="right"/>
-      <w:pPr>
-        <w:ind w:left="2160" w:hanging="180"/>
-      </w:pPr>
-    </w:lvl>
-    <w:lvl w:ilvl="3" w:tplc="4009000F" w:tentative="1">
-      <w:start w:val="1"/>
-      <w:numFmt w:val="decimal"/>
-      <w:lvlText w:val="%4."/>
-      <w:lvlJc w:val="left"/>
-      <w:pPr>
-        <w:ind w:left="2880" w:hanging="360"/>
-      </w:pPr>
-    </w:lvl>
-    <w:lvl w:ilvl="4" w:tplc="40090019" w:tentative="1">
-      <w:start w:val="1"/>
-      <w:numFmt w:val="lowerLetter"/>
-      <w:lvlText w:val="%5."/>
-      <w:lvlJc w:val="left"/>
-      <w:pPr>
-        <w:ind w:left="3600" w:hanging="360"/>
-      </w:pPr>
-    </w:lvl>
-    <w:lvl w:ilvl="5" w:tplc="4009001B" w:tentative="1">
-      <w:start w:val="1"/>
-      <w:numFmt w:val="lowerRoman"/>
-      <w:lvlText w:val="%6."/>
-      <w:lvlJc w:val="right"/>
-      <w:pPr>
-        <w:ind w:left="4320" w:hanging="180"/>
-      </w:pPr>
-    </w:lvl>
-    <w:lvl w:ilvl="6" w:tplc="4009000F" w:tentative="1">
-      <w:start w:val="1"/>
-      <w:numFmt w:val="decimal"/>
-      <w:lvlText w:val="%7."/>
-      <w:lvlJc w:val="left"/>
-      <w:pPr>
-        <w:ind w:left="5040" w:hanging="360"/>
-      </w:pPr>
-    </w:lvl>
-    <w:lvl w:ilvl="7" w:tplc="40090019" w:tentative="1">
-      <w:start w:val="1"/>
-      <w:numFmt w:val="lowerLetter"/>
-      <w:lvlText w:val="%8."/>
-      <w:lvlJc w:val="left"/>
-      <w:pPr>
-        <w:ind w:left="5760" w:hanging="360"/>
-      </w:pPr>
-    </w:lvl>
-    <w:lvl w:ilvl="8" w:tplc="4009001B" w:tentative="1">
-      <w:start w:val="1"/>
-      <w:numFmt w:val="lowerRoman"/>
-      <w:lvlText w:val="%9."/>
-      <w:lvlJc w:val="right"/>
-      <w:pPr>
-        <w:ind w:left="6480" w:hanging="180"/>
-      </w:pPr>
-    </w:lvl>
-  </w:abstractNum>
-  <w:num w:numId="1" w16cid:durableId="968171603">
-    <w:abstractNumId w:val="0"/>
-  </w:num>
-  <w:num w:numId="2" w16cid:durableId="1114864513">
-    <w:abstractNumId w:val="2"/>
-  </w:num>
-  <w:num w:numId="3" w16cid:durableId="1467578986">
-    <w:abstractNumId w:val="1"/>
-  </w:num>
-</w:numbering>
 </file>
 
 <file path=word/styles.xml><?xml version="1.0" encoding="utf-8"?>
@@ -2391,15 +2012,17 @@
   <w:docDefaults>
     <w:rPrDefault>
       <w:rPr>
-        <w:rFonts w:ascii="Arial" w:eastAsia="Arial" w:hAnsi="Arial" w:cs="Arial"/>
+        <w:rFonts w:asciiTheme="minorHAnsi" w:eastAsiaTheme="minorHAnsi" w:hAnsiTheme="minorHAnsi" w:cstheme="minorBidi"/>
+        <w:kern w:val="2"/>
         <w:sz w:val="22"/>
         <w:szCs w:val="22"/>
-        <w:lang w:val="en-GB" w:eastAsia="en-IN" w:bidi="ar-SA"/>
+        <w:lang w:val="en-IN" w:eastAsia="en-US" w:bidi="ar-SA"/>
+        <w14:ligatures w14:val="standardContextual"/>
       </w:rPr>
     </w:rPrDefault>
     <w:pPrDefault>
       <w:pPr>
-        <w:spacing w:line="276" w:lineRule="auto"/>
+        <w:spacing w:after="160" w:line="259" w:lineRule="auto"/>
       </w:pPr>
     </w:pPrDefault>
   </w:docDefaults>
@@ -2784,118 +2407,241 @@
   <w:style w:type="paragraph" w:default="1" w:styleId="Normal">
     <w:name w:val="Normal"/>
     <w:qFormat/>
+    <w:rsid w:val="00226E0A"/>
+    <w:pPr>
+      <w:spacing w:after="0" w:line="276" w:lineRule="auto"/>
+    </w:pPr>
+    <w:rPr>
+      <w:rFonts w:ascii="Arial" w:eastAsia="Arial" w:hAnsi="Arial" w:cs="Arial"/>
+      <w:kern w:val="0"/>
+      <w:lang w:val="en-GB" w:eastAsia="en-IN"/>
+      <w14:ligatures w14:val="none"/>
+    </w:rPr>
   </w:style>
   <w:style w:type="paragraph" w:styleId="Heading1">
     <w:name w:val="heading 1"/>
     <w:basedOn w:val="Normal"/>
     <w:next w:val="Normal"/>
+    <w:link w:val="Heading1Char"/>
     <w:uiPriority w:val="9"/>
     <w:qFormat/>
+    <w:rsid w:val="00226E0A"/>
     <w:pPr>
       <w:keepNext/>
       <w:keepLines/>
-      <w:spacing w:before="400" w:after="120"/>
+      <w:spacing w:before="360" w:after="80" w:line="259" w:lineRule="auto"/>
       <w:outlineLvl w:val="0"/>
     </w:pPr>
     <w:rPr>
+      <w:rFonts w:asciiTheme="majorHAnsi" w:eastAsiaTheme="majorEastAsia" w:hAnsiTheme="majorHAnsi" w:cstheme="majorBidi"/>
+      <w:color w:val="2F5496" w:themeColor="accent1" w:themeShade="BF"/>
+      <w:kern w:val="2"/>
       <w:sz w:val="40"/>
       <w:szCs w:val="40"/>
+      <w:lang w:val="en-IN" w:eastAsia="en-US"/>
+      <w14:ligatures w14:val="standardContextual"/>
     </w:rPr>
   </w:style>
   <w:style w:type="paragraph" w:styleId="Heading2">
     <w:name w:val="heading 2"/>
     <w:basedOn w:val="Normal"/>
     <w:next w:val="Normal"/>
+    <w:link w:val="Heading2Char"/>
     <w:uiPriority w:val="9"/>
     <w:semiHidden/>
     <w:unhideWhenUsed/>
     <w:qFormat/>
+    <w:rsid w:val="00226E0A"/>
     <w:pPr>
       <w:keepNext/>
       <w:keepLines/>
-      <w:spacing w:before="360" w:after="120"/>
+      <w:spacing w:before="160" w:after="80" w:line="259" w:lineRule="auto"/>
       <w:outlineLvl w:val="1"/>
     </w:pPr>
     <w:rPr>
+      <w:rFonts w:asciiTheme="majorHAnsi" w:eastAsiaTheme="majorEastAsia" w:hAnsiTheme="majorHAnsi" w:cstheme="majorBidi"/>
+      <w:color w:val="2F5496" w:themeColor="accent1" w:themeShade="BF"/>
+      <w:kern w:val="2"/>
       <w:sz w:val="32"/>
       <w:szCs w:val="32"/>
+      <w:lang w:val="en-IN" w:eastAsia="en-US"/>
+      <w14:ligatures w14:val="standardContextual"/>
     </w:rPr>
   </w:style>
   <w:style w:type="paragraph" w:styleId="Heading3">
     <w:name w:val="heading 3"/>
     <w:basedOn w:val="Normal"/>
     <w:next w:val="Normal"/>
+    <w:link w:val="Heading3Char"/>
     <w:uiPriority w:val="9"/>
     <w:semiHidden/>
     <w:unhideWhenUsed/>
     <w:qFormat/>
+    <w:rsid w:val="00226E0A"/>
     <w:pPr>
       <w:keepNext/>
       <w:keepLines/>
-      <w:spacing w:before="320" w:after="80"/>
+      <w:spacing w:before="160" w:after="80" w:line="259" w:lineRule="auto"/>
       <w:outlineLvl w:val="2"/>
     </w:pPr>
     <w:rPr>
-      <w:color w:val="434343"/>
+      <w:rFonts w:asciiTheme="minorHAnsi" w:eastAsiaTheme="majorEastAsia" w:hAnsiTheme="minorHAnsi" w:cstheme="majorBidi"/>
+      <w:color w:val="2F5496" w:themeColor="accent1" w:themeShade="BF"/>
+      <w:kern w:val="2"/>
       <w:sz w:val="28"/>
       <w:szCs w:val="28"/>
+      <w:lang w:val="en-IN" w:eastAsia="en-US"/>
+      <w14:ligatures w14:val="standardContextual"/>
     </w:rPr>
   </w:style>
   <w:style w:type="paragraph" w:styleId="Heading4">
     <w:name w:val="heading 4"/>
     <w:basedOn w:val="Normal"/>
     <w:next w:val="Normal"/>
+    <w:link w:val="Heading4Char"/>
     <w:uiPriority w:val="9"/>
     <w:semiHidden/>
     <w:unhideWhenUsed/>
     <w:qFormat/>
+    <w:rsid w:val="00226E0A"/>
     <w:pPr>
       <w:keepNext/>
       <w:keepLines/>
-      <w:spacing w:before="280" w:after="80"/>
+      <w:spacing w:before="80" w:after="40" w:line="259" w:lineRule="auto"/>
       <w:outlineLvl w:val="3"/>
     </w:pPr>
     <w:rPr>
-      <w:color w:val="666666"/>
-      <w:sz w:val="24"/>
-      <w:szCs w:val="24"/>
+      <w:rFonts w:asciiTheme="minorHAnsi" w:eastAsiaTheme="majorEastAsia" w:hAnsiTheme="minorHAnsi" w:cstheme="majorBidi"/>
+      <w:i/>
+      <w:iCs/>
+      <w:color w:val="2F5496" w:themeColor="accent1" w:themeShade="BF"/>
+      <w:kern w:val="2"/>
+      <w:lang w:val="en-IN" w:eastAsia="en-US"/>
+      <w14:ligatures w14:val="standardContextual"/>
     </w:rPr>
   </w:style>
   <w:style w:type="paragraph" w:styleId="Heading5">
     <w:name w:val="heading 5"/>
     <w:basedOn w:val="Normal"/>
     <w:next w:val="Normal"/>
+    <w:link w:val="Heading5Char"/>
     <w:uiPriority w:val="9"/>
     <w:semiHidden/>
     <w:unhideWhenUsed/>
     <w:qFormat/>
+    <w:rsid w:val="00226E0A"/>
     <w:pPr>
       <w:keepNext/>
       <w:keepLines/>
-      <w:spacing w:before="240" w:after="80"/>
+      <w:spacing w:before="80" w:after="40" w:line="259" w:lineRule="auto"/>
       <w:outlineLvl w:val="4"/>
     </w:pPr>
     <w:rPr>
-      <w:color w:val="666666"/>
+      <w:rFonts w:asciiTheme="minorHAnsi" w:eastAsiaTheme="majorEastAsia" w:hAnsiTheme="minorHAnsi" w:cstheme="majorBidi"/>
+      <w:color w:val="2F5496" w:themeColor="accent1" w:themeShade="BF"/>
+      <w:kern w:val="2"/>
+      <w:lang w:val="en-IN" w:eastAsia="en-US"/>
+      <w14:ligatures w14:val="standardContextual"/>
     </w:rPr>
   </w:style>
   <w:style w:type="paragraph" w:styleId="Heading6">
     <w:name w:val="heading 6"/>
     <w:basedOn w:val="Normal"/>
     <w:next w:val="Normal"/>
+    <w:link w:val="Heading6Char"/>
     <w:uiPriority w:val="9"/>
     <w:semiHidden/>
     <w:unhideWhenUsed/>
     <w:qFormat/>
+    <w:rsid w:val="00226E0A"/>
     <w:pPr>
       <w:keepNext/>
       <w:keepLines/>
-      <w:spacing w:before="240" w:after="80"/>
+      <w:spacing w:before="40" w:line="259" w:lineRule="auto"/>
       <w:outlineLvl w:val="5"/>
     </w:pPr>
     <w:rPr>
+      <w:rFonts w:asciiTheme="minorHAnsi" w:eastAsiaTheme="majorEastAsia" w:hAnsiTheme="minorHAnsi" w:cstheme="majorBidi"/>
       <w:i/>
-      <w:color w:val="666666"/>
+      <w:iCs/>
+      <w:color w:val="595959" w:themeColor="text1" w:themeTint="A6"/>
+      <w:kern w:val="2"/>
+      <w:lang w:val="en-IN" w:eastAsia="en-US"/>
+      <w14:ligatures w14:val="standardContextual"/>
+    </w:rPr>
+  </w:style>
+  <w:style w:type="paragraph" w:styleId="Heading7">
+    <w:name w:val="heading 7"/>
+    <w:basedOn w:val="Normal"/>
+    <w:next w:val="Normal"/>
+    <w:link w:val="Heading7Char"/>
+    <w:uiPriority w:val="9"/>
+    <w:semiHidden/>
+    <w:unhideWhenUsed/>
+    <w:qFormat/>
+    <w:rsid w:val="00226E0A"/>
+    <w:pPr>
+      <w:keepNext/>
+      <w:keepLines/>
+      <w:spacing w:before="40" w:line="259" w:lineRule="auto"/>
+      <w:outlineLvl w:val="6"/>
+    </w:pPr>
+    <w:rPr>
+      <w:rFonts w:asciiTheme="minorHAnsi" w:eastAsiaTheme="majorEastAsia" w:hAnsiTheme="minorHAnsi" w:cstheme="majorBidi"/>
+      <w:color w:val="595959" w:themeColor="text1" w:themeTint="A6"/>
+      <w:kern w:val="2"/>
+      <w:lang w:val="en-IN" w:eastAsia="en-US"/>
+      <w14:ligatures w14:val="standardContextual"/>
+    </w:rPr>
+  </w:style>
+  <w:style w:type="paragraph" w:styleId="Heading8">
+    <w:name w:val="heading 8"/>
+    <w:basedOn w:val="Normal"/>
+    <w:next w:val="Normal"/>
+    <w:link w:val="Heading8Char"/>
+    <w:uiPriority w:val="9"/>
+    <w:semiHidden/>
+    <w:unhideWhenUsed/>
+    <w:qFormat/>
+    <w:rsid w:val="00226E0A"/>
+    <w:pPr>
+      <w:keepNext/>
+      <w:keepLines/>
+      <w:spacing w:line="259" w:lineRule="auto"/>
+      <w:outlineLvl w:val="7"/>
+    </w:pPr>
+    <w:rPr>
+      <w:rFonts w:asciiTheme="minorHAnsi" w:eastAsiaTheme="majorEastAsia" w:hAnsiTheme="minorHAnsi" w:cstheme="majorBidi"/>
+      <w:i/>
+      <w:iCs/>
+      <w:color w:val="272727" w:themeColor="text1" w:themeTint="D8"/>
+      <w:kern w:val="2"/>
+      <w:lang w:val="en-IN" w:eastAsia="en-US"/>
+      <w14:ligatures w14:val="standardContextual"/>
+    </w:rPr>
+  </w:style>
+  <w:style w:type="paragraph" w:styleId="Heading9">
+    <w:name w:val="heading 9"/>
+    <w:basedOn w:val="Normal"/>
+    <w:next w:val="Normal"/>
+    <w:link w:val="Heading9Char"/>
+    <w:uiPriority w:val="9"/>
+    <w:semiHidden/>
+    <w:unhideWhenUsed/>
+    <w:qFormat/>
+    <w:rsid w:val="00226E0A"/>
+    <w:pPr>
+      <w:keepNext/>
+      <w:keepLines/>
+      <w:spacing w:line="259" w:lineRule="auto"/>
+      <w:outlineLvl w:val="8"/>
+    </w:pPr>
+    <w:rPr>
+      <w:rFonts w:asciiTheme="minorHAnsi" w:eastAsiaTheme="majorEastAsia" w:hAnsiTheme="minorHAnsi" w:cstheme="majorBidi"/>
+      <w:color w:val="272727" w:themeColor="text1" w:themeTint="D8"/>
+      <w:kern w:val="2"/>
+      <w:lang w:val="en-IN" w:eastAsia="en-US"/>
+      <w14:ligatures w14:val="standardContextual"/>
     </w:rPr>
   </w:style>
   <w:style w:type="character" w:default="1" w:styleId="DefaultParagraphFont">
@@ -2925,37 +2671,232 @@
     <w:semiHidden/>
     <w:unhideWhenUsed/>
   </w:style>
+  <w:style w:type="character" w:customStyle="1" w:styleId="Heading1Char">
+    <w:name w:val="Heading 1 Char"/>
+    <w:basedOn w:val="DefaultParagraphFont"/>
+    <w:link w:val="Heading1"/>
+    <w:uiPriority w:val="9"/>
+    <w:rsid w:val="00226E0A"/>
+    <w:rPr>
+      <w:rFonts w:asciiTheme="majorHAnsi" w:eastAsiaTheme="majorEastAsia" w:hAnsiTheme="majorHAnsi" w:cstheme="majorBidi"/>
+      <w:color w:val="2F5496" w:themeColor="accent1" w:themeShade="BF"/>
+      <w:sz w:val="40"/>
+      <w:szCs w:val="40"/>
+    </w:rPr>
+  </w:style>
+  <w:style w:type="character" w:customStyle="1" w:styleId="Heading2Char">
+    <w:name w:val="Heading 2 Char"/>
+    <w:basedOn w:val="DefaultParagraphFont"/>
+    <w:link w:val="Heading2"/>
+    <w:uiPriority w:val="9"/>
+    <w:semiHidden/>
+    <w:rsid w:val="00226E0A"/>
+    <w:rPr>
+      <w:rFonts w:asciiTheme="majorHAnsi" w:eastAsiaTheme="majorEastAsia" w:hAnsiTheme="majorHAnsi" w:cstheme="majorBidi"/>
+      <w:color w:val="2F5496" w:themeColor="accent1" w:themeShade="BF"/>
+      <w:sz w:val="32"/>
+      <w:szCs w:val="32"/>
+    </w:rPr>
+  </w:style>
+  <w:style w:type="character" w:customStyle="1" w:styleId="Heading3Char">
+    <w:name w:val="Heading 3 Char"/>
+    <w:basedOn w:val="DefaultParagraphFont"/>
+    <w:link w:val="Heading3"/>
+    <w:uiPriority w:val="9"/>
+    <w:semiHidden/>
+    <w:rsid w:val="00226E0A"/>
+    <w:rPr>
+      <w:rFonts w:eastAsiaTheme="majorEastAsia" w:cstheme="majorBidi"/>
+      <w:color w:val="2F5496" w:themeColor="accent1" w:themeShade="BF"/>
+      <w:sz w:val="28"/>
+      <w:szCs w:val="28"/>
+    </w:rPr>
+  </w:style>
+  <w:style w:type="character" w:customStyle="1" w:styleId="Heading4Char">
+    <w:name w:val="Heading 4 Char"/>
+    <w:basedOn w:val="DefaultParagraphFont"/>
+    <w:link w:val="Heading4"/>
+    <w:uiPriority w:val="9"/>
+    <w:semiHidden/>
+    <w:rsid w:val="00226E0A"/>
+    <w:rPr>
+      <w:rFonts w:eastAsiaTheme="majorEastAsia" w:cstheme="majorBidi"/>
+      <w:i/>
+      <w:iCs/>
+      <w:color w:val="2F5496" w:themeColor="accent1" w:themeShade="BF"/>
+    </w:rPr>
+  </w:style>
+  <w:style w:type="character" w:customStyle="1" w:styleId="Heading5Char">
+    <w:name w:val="Heading 5 Char"/>
+    <w:basedOn w:val="DefaultParagraphFont"/>
+    <w:link w:val="Heading5"/>
+    <w:uiPriority w:val="9"/>
+    <w:semiHidden/>
+    <w:rsid w:val="00226E0A"/>
+    <w:rPr>
+      <w:rFonts w:eastAsiaTheme="majorEastAsia" w:cstheme="majorBidi"/>
+      <w:color w:val="2F5496" w:themeColor="accent1" w:themeShade="BF"/>
+    </w:rPr>
+  </w:style>
+  <w:style w:type="character" w:customStyle="1" w:styleId="Heading6Char">
+    <w:name w:val="Heading 6 Char"/>
+    <w:basedOn w:val="DefaultParagraphFont"/>
+    <w:link w:val="Heading6"/>
+    <w:uiPriority w:val="9"/>
+    <w:semiHidden/>
+    <w:rsid w:val="00226E0A"/>
+    <w:rPr>
+      <w:rFonts w:eastAsiaTheme="majorEastAsia" w:cstheme="majorBidi"/>
+      <w:i/>
+      <w:iCs/>
+      <w:color w:val="595959" w:themeColor="text1" w:themeTint="A6"/>
+    </w:rPr>
+  </w:style>
+  <w:style w:type="character" w:customStyle="1" w:styleId="Heading7Char">
+    <w:name w:val="Heading 7 Char"/>
+    <w:basedOn w:val="DefaultParagraphFont"/>
+    <w:link w:val="Heading7"/>
+    <w:uiPriority w:val="9"/>
+    <w:semiHidden/>
+    <w:rsid w:val="00226E0A"/>
+    <w:rPr>
+      <w:rFonts w:eastAsiaTheme="majorEastAsia" w:cstheme="majorBidi"/>
+      <w:color w:val="595959" w:themeColor="text1" w:themeTint="A6"/>
+    </w:rPr>
+  </w:style>
+  <w:style w:type="character" w:customStyle="1" w:styleId="Heading8Char">
+    <w:name w:val="Heading 8 Char"/>
+    <w:basedOn w:val="DefaultParagraphFont"/>
+    <w:link w:val="Heading8"/>
+    <w:uiPriority w:val="9"/>
+    <w:semiHidden/>
+    <w:rsid w:val="00226E0A"/>
+    <w:rPr>
+      <w:rFonts w:eastAsiaTheme="majorEastAsia" w:cstheme="majorBidi"/>
+      <w:i/>
+      <w:iCs/>
+      <w:color w:val="272727" w:themeColor="text1" w:themeTint="D8"/>
+    </w:rPr>
+  </w:style>
+  <w:style w:type="character" w:customStyle="1" w:styleId="Heading9Char">
+    <w:name w:val="Heading 9 Char"/>
+    <w:basedOn w:val="DefaultParagraphFont"/>
+    <w:link w:val="Heading9"/>
+    <w:uiPriority w:val="9"/>
+    <w:semiHidden/>
+    <w:rsid w:val="00226E0A"/>
+    <w:rPr>
+      <w:rFonts w:eastAsiaTheme="majorEastAsia" w:cstheme="majorBidi"/>
+      <w:color w:val="272727" w:themeColor="text1" w:themeTint="D8"/>
+    </w:rPr>
+  </w:style>
   <w:style w:type="paragraph" w:styleId="Title">
     <w:name w:val="Title"/>
     <w:basedOn w:val="Normal"/>
     <w:next w:val="Normal"/>
+    <w:link w:val="TitleChar"/>
     <w:uiPriority w:val="10"/>
     <w:qFormat/>
+    <w:rsid w:val="00226E0A"/>
     <w:pPr>
-      <w:keepNext/>
-      <w:keepLines/>
-      <w:spacing w:after="60"/>
+      <w:spacing w:after="80" w:line="240" w:lineRule="auto"/>
+      <w:contextualSpacing/>
     </w:pPr>
     <w:rPr>
-      <w:sz w:val="52"/>
-      <w:szCs w:val="52"/>
+      <w:rFonts w:asciiTheme="majorHAnsi" w:eastAsiaTheme="majorEastAsia" w:hAnsiTheme="majorHAnsi" w:cstheme="majorBidi"/>
+      <w:spacing w:val="-10"/>
+      <w:kern w:val="28"/>
+      <w:sz w:val="56"/>
+      <w:szCs w:val="56"/>
+      <w:lang w:val="en-IN" w:eastAsia="en-US"/>
+      <w14:ligatures w14:val="standardContextual"/>
+    </w:rPr>
+  </w:style>
+  <w:style w:type="character" w:customStyle="1" w:styleId="TitleChar">
+    <w:name w:val="Title Char"/>
+    <w:basedOn w:val="DefaultParagraphFont"/>
+    <w:link w:val="Title"/>
+    <w:uiPriority w:val="10"/>
+    <w:rsid w:val="00226E0A"/>
+    <w:rPr>
+      <w:rFonts w:asciiTheme="majorHAnsi" w:eastAsiaTheme="majorEastAsia" w:hAnsiTheme="majorHAnsi" w:cstheme="majorBidi"/>
+      <w:spacing w:val="-10"/>
+      <w:kern w:val="28"/>
+      <w:sz w:val="56"/>
+      <w:szCs w:val="56"/>
     </w:rPr>
   </w:style>
   <w:style w:type="paragraph" w:styleId="Subtitle">
     <w:name w:val="Subtitle"/>
     <w:basedOn w:val="Normal"/>
     <w:next w:val="Normal"/>
+    <w:link w:val="SubtitleChar"/>
     <w:uiPriority w:val="11"/>
     <w:qFormat/>
+    <w:rsid w:val="00226E0A"/>
     <w:pPr>
-      <w:keepNext/>
-      <w:keepLines/>
-      <w:spacing w:after="320"/>
+      <w:numPr>
+        <w:ilvl w:val="1"/>
+      </w:numPr>
+      <w:spacing w:after="160" w:line="259" w:lineRule="auto"/>
     </w:pPr>
     <w:rPr>
-      <w:color w:val="666666"/>
-      <w:sz w:val="30"/>
-      <w:szCs w:val="30"/>
+      <w:rFonts w:asciiTheme="minorHAnsi" w:eastAsiaTheme="majorEastAsia" w:hAnsiTheme="minorHAnsi" w:cstheme="majorBidi"/>
+      <w:color w:val="595959" w:themeColor="text1" w:themeTint="A6"/>
+      <w:spacing w:val="15"/>
+      <w:kern w:val="2"/>
+      <w:sz w:val="28"/>
+      <w:szCs w:val="28"/>
+      <w:lang w:val="en-IN" w:eastAsia="en-US"/>
+      <w14:ligatures w14:val="standardContextual"/>
+    </w:rPr>
+  </w:style>
+  <w:style w:type="character" w:customStyle="1" w:styleId="SubtitleChar">
+    <w:name w:val="Subtitle Char"/>
+    <w:basedOn w:val="DefaultParagraphFont"/>
+    <w:link w:val="Subtitle"/>
+    <w:uiPriority w:val="11"/>
+    <w:rsid w:val="00226E0A"/>
+    <w:rPr>
+      <w:rFonts w:eastAsiaTheme="majorEastAsia" w:cstheme="majorBidi"/>
+      <w:color w:val="595959" w:themeColor="text1" w:themeTint="A6"/>
+      <w:spacing w:val="15"/>
+      <w:sz w:val="28"/>
+      <w:szCs w:val="28"/>
+    </w:rPr>
+  </w:style>
+  <w:style w:type="paragraph" w:styleId="Quote">
+    <w:name w:val="Quote"/>
+    <w:basedOn w:val="Normal"/>
+    <w:next w:val="Normal"/>
+    <w:link w:val="QuoteChar"/>
+    <w:uiPriority w:val="29"/>
+    <w:qFormat/>
+    <w:rsid w:val="00226E0A"/>
+    <w:pPr>
+      <w:spacing w:before="160" w:after="160" w:line="259" w:lineRule="auto"/>
+      <w:jc w:val="center"/>
+    </w:pPr>
+    <w:rPr>
+      <w:rFonts w:asciiTheme="minorHAnsi" w:eastAsiaTheme="minorHAnsi" w:hAnsiTheme="minorHAnsi" w:cstheme="minorBidi"/>
+      <w:i/>
+      <w:iCs/>
+      <w:color w:val="404040" w:themeColor="text1" w:themeTint="BF"/>
+      <w:kern w:val="2"/>
+      <w:lang w:val="en-IN" w:eastAsia="en-US"/>
+      <w14:ligatures w14:val="standardContextual"/>
+    </w:rPr>
+  </w:style>
+  <w:style w:type="character" w:customStyle="1" w:styleId="QuoteChar">
+    <w:name w:val="Quote Char"/>
+    <w:basedOn w:val="DefaultParagraphFont"/>
+    <w:link w:val="Quote"/>
+    <w:uiPriority w:val="29"/>
+    <w:rsid w:val="00226E0A"/>
+    <w:rPr>
+      <w:i/>
+      <w:iCs/>
+      <w:color w:val="404040" w:themeColor="text1" w:themeTint="BF"/>
     </w:rPr>
   </w:style>
   <w:style w:type="paragraph" w:styleId="ListParagraph">
@@ -2963,7 +2904,7 @@
     <w:basedOn w:val="Normal"/>
     <w:uiPriority w:val="34"/>
     <w:qFormat/>
-    <w:rsid w:val="00862B5F"/>
+    <w:rsid w:val="00226E0A"/>
     <w:pPr>
       <w:spacing w:after="160" w:line="259" w:lineRule="auto"/>
       <w:ind w:left="720"/>
@@ -2971,7 +2912,74 @@
     </w:pPr>
     <w:rPr>
       <w:rFonts w:asciiTheme="minorHAnsi" w:eastAsiaTheme="minorHAnsi" w:hAnsiTheme="minorHAnsi" w:cstheme="minorBidi"/>
+      <w:kern w:val="2"/>
       <w:lang w:val="en-IN" w:eastAsia="en-US"/>
+      <w14:ligatures w14:val="standardContextual"/>
+    </w:rPr>
+  </w:style>
+  <w:style w:type="character" w:styleId="IntenseEmphasis">
+    <w:name w:val="Intense Emphasis"/>
+    <w:basedOn w:val="DefaultParagraphFont"/>
+    <w:uiPriority w:val="21"/>
+    <w:qFormat/>
+    <w:rsid w:val="00226E0A"/>
+    <w:rPr>
+      <w:i/>
+      <w:iCs/>
+      <w:color w:val="2F5496" w:themeColor="accent1" w:themeShade="BF"/>
+    </w:rPr>
+  </w:style>
+  <w:style w:type="paragraph" w:styleId="IntenseQuote">
+    <w:name w:val="Intense Quote"/>
+    <w:basedOn w:val="Normal"/>
+    <w:next w:val="Normal"/>
+    <w:link w:val="IntenseQuoteChar"/>
+    <w:uiPriority w:val="30"/>
+    <w:qFormat/>
+    <w:rsid w:val="00226E0A"/>
+    <w:pPr>
+      <w:pBdr>
+        <w:top w:val="single" w:sz="4" w:space="10" w:color="2F5496" w:themeColor="accent1" w:themeShade="BF"/>
+        <w:bottom w:val="single" w:sz="4" w:space="10" w:color="2F5496" w:themeColor="accent1" w:themeShade="BF"/>
+      </w:pBdr>
+      <w:spacing w:before="360" w:after="360" w:line="259" w:lineRule="auto"/>
+      <w:ind w:left="864" w:right="864"/>
+      <w:jc w:val="center"/>
+    </w:pPr>
+    <w:rPr>
+      <w:rFonts w:asciiTheme="minorHAnsi" w:eastAsiaTheme="minorHAnsi" w:hAnsiTheme="minorHAnsi" w:cstheme="minorBidi"/>
+      <w:i/>
+      <w:iCs/>
+      <w:color w:val="2F5496" w:themeColor="accent1" w:themeShade="BF"/>
+      <w:kern w:val="2"/>
+      <w:lang w:val="en-IN" w:eastAsia="en-US"/>
+      <w14:ligatures w14:val="standardContextual"/>
+    </w:rPr>
+  </w:style>
+  <w:style w:type="character" w:customStyle="1" w:styleId="IntenseQuoteChar">
+    <w:name w:val="Intense Quote Char"/>
+    <w:basedOn w:val="DefaultParagraphFont"/>
+    <w:link w:val="IntenseQuote"/>
+    <w:uiPriority w:val="30"/>
+    <w:rsid w:val="00226E0A"/>
+    <w:rPr>
+      <w:i/>
+      <w:iCs/>
+      <w:color w:val="2F5496" w:themeColor="accent1" w:themeShade="BF"/>
+    </w:rPr>
+  </w:style>
+  <w:style w:type="character" w:styleId="IntenseReference">
+    <w:name w:val="Intense Reference"/>
+    <w:basedOn w:val="DefaultParagraphFont"/>
+    <w:uiPriority w:val="32"/>
+    <w:qFormat/>
+    <w:rsid w:val="00226E0A"/>
+    <w:rPr>
+      <w:b/>
+      <w:bCs/>
+      <w:smallCaps/>
+      <w:color w:val="2F5496" w:themeColor="accent1" w:themeShade="BF"/>
+      <w:spacing w:val="5"/>
     </w:rPr>
   </w:style>
   <w:style w:type="character" w:styleId="Hyperlink">
@@ -2979,34 +2987,66 @@
     <w:basedOn w:val="DefaultParagraphFont"/>
     <w:uiPriority w:val="99"/>
     <w:unhideWhenUsed/>
-    <w:rsid w:val="00CA5937"/>
+    <w:rsid w:val="00226E0A"/>
     <w:rPr>
-      <w:color w:val="0000FF" w:themeColor="hyperlink"/>
+      <w:color w:val="0563C1" w:themeColor="hyperlink"/>
       <w:u w:val="single"/>
     </w:rPr>
   </w:style>
-  <w:style w:type="character" w:styleId="UnresolvedMention">
-    <w:name w:val="Unresolved Mention"/>
+  <w:style w:type="paragraph" w:styleId="Header">
+    <w:name w:val="header"/>
+    <w:basedOn w:val="Normal"/>
+    <w:link w:val="HeaderChar"/>
+    <w:uiPriority w:val="99"/>
+    <w:unhideWhenUsed/>
+    <w:rsid w:val="00226E0A"/>
+    <w:pPr>
+      <w:tabs>
+        <w:tab w:val="center" w:pos="4513"/>
+        <w:tab w:val="right" w:pos="9026"/>
+      </w:tabs>
+      <w:spacing w:line="240" w:lineRule="auto"/>
+    </w:pPr>
+  </w:style>
+  <w:style w:type="character" w:customStyle="1" w:styleId="HeaderChar">
+    <w:name w:val="Header Char"/>
     <w:basedOn w:val="DefaultParagraphFont"/>
+    <w:link w:val="Header"/>
     <w:uiPriority w:val="99"/>
-    <w:semiHidden/>
+    <w:rsid w:val="00226E0A"/>
+    <w:rPr>
+      <w:rFonts w:ascii="Arial" w:eastAsia="Arial" w:hAnsi="Arial" w:cs="Arial"/>
+      <w:kern w:val="0"/>
+      <w:lang w:val="en-GB" w:eastAsia="en-IN"/>
+      <w14:ligatures w14:val="none"/>
+    </w:rPr>
+  </w:style>
+  <w:style w:type="paragraph" w:styleId="Footer">
+    <w:name w:val="footer"/>
+    <w:basedOn w:val="Normal"/>
+    <w:link w:val="FooterChar"/>
+    <w:uiPriority w:val="99"/>
     <w:unhideWhenUsed/>
-    <w:rsid w:val="00CA5937"/>
+    <w:rsid w:val="00226E0A"/>
+    <w:pPr>
+      <w:tabs>
+        <w:tab w:val="center" w:pos="4513"/>
+        <w:tab w:val="right" w:pos="9026"/>
+      </w:tabs>
+      <w:spacing w:line="240" w:lineRule="auto"/>
+    </w:pPr>
+  </w:style>
+  <w:style w:type="character" w:customStyle="1" w:styleId="FooterChar">
+    <w:name w:val="Footer Char"/>
+    <w:basedOn w:val="DefaultParagraphFont"/>
+    <w:link w:val="Footer"/>
+    <w:uiPriority w:val="99"/>
+    <w:rsid w:val="00226E0A"/>
     <w:rPr>
-      <w:color w:val="605E5C"/>
-      <w:shd w:val="clear" w:color="auto" w:fill="E1DFDD"/>
-    </w:rPr>
-  </w:style>
-  <w:style w:type="character" w:styleId="FollowedHyperlink">
-    <w:name w:val="FollowedHyperlink"/>
-    <w:basedOn w:val="DefaultParagraphFont"/>
-    <w:uiPriority w:val="99"/>
-    <w:semiHidden/>
-    <w:unhideWhenUsed/>
-    <w:rsid w:val="000F5BC9"/>
-    <w:rPr>
-      <w:color w:val="800080" w:themeColor="followedHyperlink"/>
-      <w:u w:val="single"/>
+      <w:rFonts w:ascii="Arial" w:eastAsia="Arial" w:hAnsi="Arial" w:cs="Arial"/>
+      <w:kern w:val="0"/>
+      <w:lang w:val="en-GB" w:eastAsia="en-IN"/>
+      <w14:ligatures w14:val="none"/>
     </w:rPr>
   </w:style>
 </w:styles>
@@ -3023,44 +3063,44 @@
         <a:sysClr val="window" lastClr="FFFFFF"/>
       </a:lt1>
       <a:dk2>
-        <a:srgbClr val="1F497D"/>
+        <a:srgbClr val="44546A"/>
       </a:dk2>
       <a:lt2>
-        <a:srgbClr val="EEECE1"/>
+        <a:srgbClr val="E7E6E6"/>
       </a:lt2>
       <a:accent1>
-        <a:srgbClr val="4F81BD"/>
+        <a:srgbClr val="4472C4"/>
       </a:accent1>
       <a:accent2>
-        <a:srgbClr val="C0504D"/>
+        <a:srgbClr val="ED7D31"/>
       </a:accent2>
       <a:accent3>
-        <a:srgbClr val="9BBB59"/>
+        <a:srgbClr val="A5A5A5"/>
       </a:accent3>
       <a:accent4>
-        <a:srgbClr val="8064A2"/>
+        <a:srgbClr val="FFC000"/>
       </a:accent4>
       <a:accent5>
-        <a:srgbClr val="4BACC6"/>
+        <a:srgbClr val="5B9BD5"/>
       </a:accent5>
       <a:accent6>
-        <a:srgbClr val="F79646"/>
+        <a:srgbClr val="70AD47"/>
       </a:accent6>
       <a:hlink>
-        <a:srgbClr val="0000FF"/>
+        <a:srgbClr val="0563C1"/>
       </a:hlink>
       <a:folHlink>
-        <a:srgbClr val="800080"/>
+        <a:srgbClr val="954F72"/>
       </a:folHlink>
     </a:clrScheme>
     <a:fontScheme name="Office">
       <a:majorFont>
-        <a:latin typeface="Calibri"/>
+        <a:latin typeface="Calibri Light" panose="020F0302020204030204"/>
         <a:ea typeface=""/>
         <a:cs typeface=""/>
-        <a:font script="Jpan" typeface="ＭＳ ゴシック"/>
+        <a:font script="Jpan" typeface="游ゴシック Light"/>
         <a:font script="Hang" typeface="맑은 고딕"/>
-        <a:font script="Hans" typeface="宋体"/>
+        <a:font script="Hans" typeface="等线 Light"/>
         <a:font script="Hant" typeface="新細明體"/>
         <a:font script="Arab" typeface="Times New Roman"/>
         <a:font script="Hebr" typeface="Times New Roman"/>
@@ -3088,14 +3128,31 @@
         <a:font script="Viet" typeface="Times New Roman"/>
         <a:font script="Uigh" typeface="Microsoft Uighur"/>
         <a:font script="Geor" typeface="Sylfaen"/>
+        <a:font script="Armn" typeface="Arial"/>
+        <a:font script="Bugi" typeface="Leelawadee UI"/>
+        <a:font script="Bopo" typeface="Microsoft JhengHei"/>
+        <a:font script="Java" typeface="Javanese Text"/>
+        <a:font script="Lisu" typeface="Segoe UI"/>
+        <a:font script="Mymr" typeface="Myanmar Text"/>
+        <a:font script="Nkoo" typeface="Ebrima"/>
+        <a:font script="Olck" typeface="Nirmala UI"/>
+        <a:font script="Osma" typeface="Ebrima"/>
+        <a:font script="Phag" typeface="Phagspa"/>
+        <a:font script="Syrn" typeface="Estrangelo Edessa"/>
+        <a:font script="Syrj" typeface="Estrangelo Edessa"/>
+        <a:font script="Syre" typeface="Estrangelo Edessa"/>
+        <a:font script="Sora" typeface="Nirmala UI"/>
+        <a:font script="Tale" typeface="Microsoft Tai Le"/>
+        <a:font script="Talu" typeface="Microsoft New Tai Lue"/>
+        <a:font script="Tfng" typeface="Ebrima"/>
       </a:majorFont>
       <a:minorFont>
-        <a:latin typeface="Cambria"/>
+        <a:latin typeface="Calibri" panose="020F0502020204030204"/>
         <a:ea typeface=""/>
         <a:cs typeface=""/>
-        <a:font script="Jpan" typeface="ＭＳ 明朝"/>
+        <a:font script="Jpan" typeface="游ゴシック"/>
         <a:font script="Hang" typeface="맑은 고딕"/>
-        <a:font script="Hans" typeface="宋体"/>
+        <a:font script="Hans" typeface="等线"/>
         <a:font script="Hant" typeface="新細明體"/>
         <a:font script="Arab" typeface="Arial"/>
         <a:font script="Hebr" typeface="Arial"/>
@@ -3123,6 +3180,23 @@
         <a:font script="Viet" typeface="Arial"/>
         <a:font script="Uigh" typeface="Microsoft Uighur"/>
         <a:font script="Geor" typeface="Sylfaen"/>
+        <a:font script="Armn" typeface="Arial"/>
+        <a:font script="Bugi" typeface="Leelawadee UI"/>
+        <a:font script="Bopo" typeface="Microsoft JhengHei"/>
+        <a:font script="Java" typeface="Javanese Text"/>
+        <a:font script="Lisu" typeface="Segoe UI"/>
+        <a:font script="Mymr" typeface="Myanmar Text"/>
+        <a:font script="Nkoo" typeface="Ebrima"/>
+        <a:font script="Olck" typeface="Nirmala UI"/>
+        <a:font script="Osma" typeface="Ebrima"/>
+        <a:font script="Phag" typeface="Phagspa"/>
+        <a:font script="Syrn" typeface="Estrangelo Edessa"/>
+        <a:font script="Syrj" typeface="Estrangelo Edessa"/>
+        <a:font script="Syre" typeface="Estrangelo Edessa"/>
+        <a:font script="Sora" typeface="Nirmala UI"/>
+        <a:font script="Tale" typeface="Microsoft Tai Le"/>
+        <a:font script="Talu" typeface="Microsoft New Tai Lue"/>
+        <a:font script="Tfng" typeface="Ebrima"/>
       </a:minorFont>
     </a:fontScheme>
     <a:fmtScheme name="Office">
@@ -3134,200 +3208,141 @@
           <a:gsLst>
             <a:gs pos="0">
               <a:schemeClr val="phClr">
-                <a:tint val="50000"/>
-                <a:satMod val="300000"/>
+                <a:lumMod val="110000"/>
+                <a:satMod val="105000"/>
+                <a:tint val="67000"/>
               </a:schemeClr>
             </a:gs>
-            <a:gs pos="35000">
+            <a:gs pos="50000">
               <a:schemeClr val="phClr">
-                <a:tint val="37000"/>
-                <a:satMod val="300000"/>
+                <a:lumMod val="105000"/>
+                <a:satMod val="103000"/>
+                <a:tint val="73000"/>
               </a:schemeClr>
             </a:gs>
             <a:gs pos="100000">
               <a:schemeClr val="phClr">
-                <a:tint val="15000"/>
-                <a:satMod val="350000"/>
+                <a:lumMod val="105000"/>
+                <a:satMod val="109000"/>
+                <a:tint val="81000"/>
               </a:schemeClr>
             </a:gs>
           </a:gsLst>
-          <a:lin ang="16200000" scaled="1"/>
+          <a:lin ang="5400000" scaled="0"/>
         </a:gradFill>
         <a:gradFill rotWithShape="1">
           <a:gsLst>
             <a:gs pos="0">
               <a:schemeClr val="phClr">
-                <a:tint val="100000"/>
+                <a:satMod val="103000"/>
+                <a:lumMod val="102000"/>
+                <a:tint val="94000"/>
+              </a:schemeClr>
+            </a:gs>
+            <a:gs pos="50000">
+              <a:schemeClr val="phClr">
+                <a:satMod val="110000"/>
+                <a:lumMod val="100000"/>
                 <a:shade val="100000"/>
-                <a:satMod val="130000"/>
               </a:schemeClr>
             </a:gs>
             <a:gs pos="100000">
               <a:schemeClr val="phClr">
-                <a:tint val="50000"/>
-                <a:shade val="100000"/>
-                <a:satMod val="350000"/>
+                <a:lumMod val="99000"/>
+                <a:satMod val="120000"/>
+                <a:shade val="78000"/>
               </a:schemeClr>
             </a:gs>
           </a:gsLst>
-          <a:lin ang="16200000" scaled="0"/>
+          <a:lin ang="5400000" scaled="0"/>
         </a:gradFill>
       </a:fillStyleLst>
       <a:lnStyleLst>
-        <a:ln w="9525" cap="flat" cmpd="sng" algn="ctr">
-          <a:solidFill>
-            <a:schemeClr val="phClr">
-              <a:shade val="95000"/>
-              <a:satMod val="105000"/>
-            </a:schemeClr>
-          </a:solidFill>
-          <a:prstDash val="solid"/>
-        </a:ln>
-        <a:ln w="25400" cap="flat" cmpd="sng" algn="ctr">
+        <a:ln w="6350" cap="flat" cmpd="sng" algn="ctr">
           <a:solidFill>
             <a:schemeClr val="phClr"/>
           </a:solidFill>
           <a:prstDash val="solid"/>
+          <a:miter lim="800000"/>
         </a:ln>
-        <a:ln w="38100" cap="flat" cmpd="sng" algn="ctr">
+        <a:ln w="12700" cap="flat" cmpd="sng" algn="ctr">
           <a:solidFill>
             <a:schemeClr val="phClr"/>
           </a:solidFill>
           <a:prstDash val="solid"/>
+          <a:miter lim="800000"/>
+        </a:ln>
+        <a:ln w="19050" cap="flat" cmpd="sng" algn="ctr">
+          <a:solidFill>
+            <a:schemeClr val="phClr"/>
+          </a:solidFill>
+          <a:prstDash val="solid"/>
+          <a:miter lim="800000"/>
         </a:ln>
       </a:lnStyleLst>
       <a:effectStyleLst>
         <a:effectStyle>
+          <a:effectLst/>
+        </a:effectStyle>
+        <a:effectStyle>
+          <a:effectLst/>
+        </a:effectStyle>
+        <a:effectStyle>
           <a:effectLst>
-            <a:outerShdw blurRad="40000" dist="20000" dir="5400000" rotWithShape="0">
+            <a:outerShdw blurRad="57150" dist="19050" dir="5400000" algn="ctr" rotWithShape="0">
               <a:srgbClr val="000000">
-                <a:alpha val="38000"/>
+                <a:alpha val="63000"/>
               </a:srgbClr>
             </a:outerShdw>
           </a:effectLst>
-        </a:effectStyle>
-        <a:effectStyle>
-          <a:effectLst>
-            <a:outerShdw blurRad="40000" dist="23000" dir="5400000" rotWithShape="0">
-              <a:srgbClr val="000000">
-                <a:alpha val="35000"/>
-              </a:srgbClr>
-            </a:outerShdw>
-          </a:effectLst>
-        </a:effectStyle>
-        <a:effectStyle>
-          <a:effectLst>
-            <a:outerShdw blurRad="40000" dist="23000" dir="5400000" rotWithShape="0">
-              <a:srgbClr val="000000">
-                <a:alpha val="35000"/>
-              </a:srgbClr>
-            </a:outerShdw>
-          </a:effectLst>
-          <a:scene3d>
-            <a:camera prst="orthographicFront">
-              <a:rot lat="0" lon="0" rev="0"/>
-            </a:camera>
-            <a:lightRig rig="threePt" dir="t">
-              <a:rot lat="0" lon="0" rev="1200000"/>
-            </a:lightRig>
-          </a:scene3d>
-          <a:sp3d>
-            <a:bevelT w="63500" h="25400"/>
-          </a:sp3d>
         </a:effectStyle>
       </a:effectStyleLst>
       <a:bgFillStyleLst>
         <a:solidFill>
           <a:schemeClr val="phClr"/>
         </a:solidFill>
+        <a:solidFill>
+          <a:schemeClr val="phClr">
+            <a:tint val="95000"/>
+            <a:satMod val="170000"/>
+          </a:schemeClr>
+        </a:solidFill>
         <a:gradFill rotWithShape="1">
           <a:gsLst>
             <a:gs pos="0">
               <a:schemeClr val="phClr">
-                <a:tint val="40000"/>
-                <a:satMod val="350000"/>
+                <a:tint val="93000"/>
+                <a:satMod val="150000"/>
+                <a:shade val="98000"/>
+                <a:lumMod val="102000"/>
               </a:schemeClr>
             </a:gs>
-            <a:gs pos="40000">
+            <a:gs pos="50000">
               <a:schemeClr val="phClr">
-                <a:tint val="45000"/>
-                <a:shade val="99000"/>
-                <a:satMod val="350000"/>
+                <a:tint val="98000"/>
+                <a:satMod val="130000"/>
+                <a:shade val="90000"/>
+                <a:lumMod val="103000"/>
               </a:schemeClr>
             </a:gs>
             <a:gs pos="100000">
               <a:schemeClr val="phClr">
-                <a:shade val="20000"/>
-                <a:satMod val="255000"/>
+                <a:shade val="63000"/>
+                <a:satMod val="120000"/>
               </a:schemeClr>
             </a:gs>
           </a:gsLst>
-          <a:path path="circle">
-            <a:fillToRect l="50000" t="-80000" r="50000" b="180000"/>
-          </a:path>
-        </a:gradFill>
-        <a:gradFill rotWithShape="1">
-          <a:gsLst>
-            <a:gs pos="0">
-              <a:schemeClr val="phClr">
-                <a:tint val="80000"/>
-                <a:satMod val="300000"/>
-              </a:schemeClr>
-            </a:gs>
-            <a:gs pos="100000">
-              <a:schemeClr val="phClr">
-                <a:shade val="30000"/>
-                <a:satMod val="200000"/>
-              </a:schemeClr>
-            </a:gs>
-          </a:gsLst>
-          <a:path path="circle">
-            <a:fillToRect l="50000" t="50000" r="50000" b="50000"/>
-          </a:path>
+          <a:lin ang="5400000" scaled="0"/>
         </a:gradFill>
       </a:bgFillStyleLst>
     </a:fmtScheme>
   </a:themeElements>
-  <a:objectDefaults>
-    <a:spDef>
-      <a:spPr/>
-      <a:bodyPr/>
-      <a:lstStyle/>
-      <a:style>
-        <a:lnRef idx="1">
-          <a:schemeClr val="accent1"/>
-        </a:lnRef>
-        <a:fillRef idx="3">
-          <a:schemeClr val="accent1"/>
-        </a:fillRef>
-        <a:effectRef idx="2">
-          <a:schemeClr val="accent1"/>
-        </a:effectRef>
-        <a:fontRef idx="minor">
-          <a:schemeClr val="lt1"/>
-        </a:fontRef>
-      </a:style>
-    </a:spDef>
-    <a:lnDef>
-      <a:spPr/>
-      <a:bodyPr/>
-      <a:lstStyle/>
-      <a:style>
-        <a:lnRef idx="2">
-          <a:schemeClr val="accent1"/>
-        </a:lnRef>
-        <a:fillRef idx="0">
-          <a:schemeClr val="accent1"/>
-        </a:fillRef>
-        <a:effectRef idx="1">
-          <a:schemeClr val="accent1"/>
-        </a:effectRef>
-        <a:fontRef idx="minor">
-          <a:schemeClr val="tx1"/>
-        </a:fontRef>
-      </a:style>
-    </a:lnDef>
-  </a:objectDefaults>
+  <a:objectDefaults/>
   <a:extraClrSchemeLst/>
+  <a:extLst>
+    <a:ext uri="{05A4C25C-085E-4340-85A3-A5531E510DB2}">
+      <thm15:themeFamily xmlns:thm15="http://schemas.microsoft.com/office/thememl/2012/main" name="Office Theme" id="{62F939B6-93AF-4DB8-9C6B-D6C7DFDC589F}" vid="{4A3C46E8-61CC-4603-A589-7422A47A8E4A}"/>
+    </a:ext>
+  </a:extLst>
 </a:theme>
 </file>
</xml_diff>